<commit_message>
feat: add Google Reviews integration with API and UI components
- Implemented a new API route for fetching Google Place reviews.
- Created a GoogleReviewsPanel component to display reviews with localization support.
- Added tests for the GoogleReviewsPanel to ensure proper rendering and functionality.
- Developed utility functions for normalizing Google Places API responses.
- Included structured data for Google Business identity in SEO metadata.
- Ensured error handling for API requests and fallback scenarios.
</commit_message>
<xml_diff>
--- a/docs/laporan-seo/LAPORAN-SEO-NUSABEETRIP-BULAN-1-3-DAN-RENCANA-4-6.docx
+++ b/docs/laporan-seo/LAPORAN-SEO-NUSABEETRIP-BULAN-1-3-DAN-RENCANA-4-6.docx
@@ -6257,7 +6257,7 @@
           <w:sz w:val="21"/>
           <w:szCs w:val="21"/>
         </w:rPr>
-        <w:t xml:space="preserve">Konfirmasi alamat dan jam operasional. GBP menampilkan Desa Banjarnyuh, Ped dan buka pukul 08.00, sedangkan website/schema masih menggunakan alamat lebih umum serta jam layanan 06.00-22.00. Perlu dibedakan jam lokasi fisik dan jam layanan WhatsApp.</w:t>
+        <w:t xml:space="preserve">Konfirmasi jam operasional. Alamat dan koordinat website/schema sudah diselaraskan dengan listing GBP di Desa Banjarnyuh, Ped. Jam GBP perlu dikonfirmasi karena website menyebut jam layanan tur/rental 06.00-22.00; bedakan jam lokasi fisik dan jam layanan WhatsApp sebelum diselaraskan.</w:t>
       </w:r>
     </w:p>
     <w:p>
@@ -7419,7 +7419,7 @@
       <w:pPr>
         <w:spacing w:after="100"/>
       </w:pPr>
-      <w:hyperlink w:history="1" r:id="rIdf4jce81q26mew9vjj5wac">
+      <w:hyperlink w:history="1" r:id="rId2p7neende7zhkwzj579ql">
         <w:r>
           <w:rPr>
             <w:rFonts w:ascii="Arial" w:cs="Arial" w:eastAsia="Arial" w:hAnsi="Arial"/>
@@ -7435,7 +7435,7 @@
       <w:pPr>
         <w:spacing w:after="100"/>
       </w:pPr>
-      <w:hyperlink w:history="1" r:id="rIdq8ie1mpgp-w3hja-sy7bv">
+      <w:hyperlink w:history="1" r:id="rIdvsqxuuwyox7mpvyrq6f-3">
         <w:r>
           <w:rPr>
             <w:rFonts w:ascii="Arial" w:cs="Arial" w:eastAsia="Arial" w:hAnsi="Arial"/>
@@ -7451,7 +7451,7 @@
       <w:pPr>
         <w:spacing w:after="100"/>
       </w:pPr>
-      <w:hyperlink w:history="1" r:id="rIdw-4upl0jokhb8qfcpdoje">
+      <w:hyperlink w:history="1" r:id="rIdxfx5mriq2-rgnyjquxjam">
         <w:r>
           <w:rPr>
             <w:rFonts w:ascii="Arial" w:cs="Arial" w:eastAsia="Arial" w:hAnsi="Arial"/>
@@ -7467,7 +7467,7 @@
       <w:pPr>
         <w:spacing w:after="100"/>
       </w:pPr>
-      <w:hyperlink w:history="1" r:id="rId9bixwihpgaox8m9hi9h2e">
+      <w:hyperlink w:history="1" r:id="rIdgopspza87y4eytmuebxn2">
         <w:r>
           <w:rPr>
             <w:rFonts w:ascii="Arial" w:cs="Arial" w:eastAsia="Arial" w:hAnsi="Arial"/>

</xml_diff>